<commit_message>
Make Sri Lankan invoices payable within 14 days
A reviewer found 4.0 saying invoices are payable on receipt while 13.2
gave the end-of-contract invoice 14 days. Asitha chose 14 days for every
Sri Lankan invoice, as in Australia (7 October 2026).

- 4.0: every invoice is payable within 14 days of its date.
- The final payment is invoiced on acceptance, not "due" on it, in 3.3,
  4.0, 15.0 and the web and mobile app's acceptance clause; 13.2 points
  to 4.0.
- The four-part split's advance is "invoiced on signing".

Checked: the four Sri Lankan samples differ from the previous build only
in those lines, and none still says "on receipt".

Co-Authored-By: Claude Opus 5.5 <noreply@anthropic.com>
</commit_message>
<xml_diff>
--- a/template/atp-website-lk.docx
+++ b/template/atp-website-lk.docx
@@ -3497,7 +3497,7 @@
           <w:sz w:val="20"/>
           <w:szCs w:val="20"/>
         </w:rPr>
-        <w:t xml:space="preserve">The Provider plans its work to meet every agreed deadline, and relies on the Client to do the same by providing approvals, sign-offs and content on time. Delays in the Client’s approvals, and work outside the agreed scope, will move the project schedule and delivery dates back accordingly, but payment milestones remain due on the dates the timeline in section 3.1 gives them, other than the final payment, which is due on acceptance under section 3.4. If the Provider misses a deadline for reasons within its control, the payment milestones move back accordingly. The Provider manages the project and its schedule.</w:t>
+        <w:t xml:space="preserve">The Provider plans its work to meet every agreed deadline, and relies on the Client to do the same by providing approvals, sign-offs and content on time. Delays in the Client’s approvals, and work outside the agreed scope, will move the project schedule and delivery dates back accordingly, but payment milestones remain due on the dates the timeline in section 3.1 gives them, other than the final payment, which is invoiced on acceptance under section 3.4. If the Provider misses a deadline for reasons within its control, the payment milestones move back accordingly. The Provider manages the project and its schedule.</w:t>
       </w:r>
     </w:p>
     <w:p>
@@ -4221,7 +4221,7 @@
           <w:sz w:val="20"/>
           <w:szCs w:val="20"/>
         </w:rPr>
-        <w:t xml:space="preserve">The web and mobile app is accepted as a whole. A critical or major defect in either part holds up sign-off of both, and the final payment falls due on acceptance of the whole.</w:t>
+        <w:t xml:space="preserve">The web and mobile app is accepted as a whole. A critical or major defect in either part holds up sign-off of both, and the final payment is invoiced when the whole is accepted.</w:t>
       </w:r>
     </w:p>
     <w:p>
@@ -6304,7 +6304,7 @@
           <w:sz w:val="20"/>
           <w:szCs w:val="20"/>
         </w:rPr>
-        <w:t xml:space="preserve">The Client agrees to pay the Provider in accordance with the payment schedule in section 2.5, which is the only schedule of payments under this Agreement. All fees are due and payable on receipt of invoice, including those for any stock photography or other purchased materials authorised for the project. Each invoice is payable in full, without set-off or deduction, other than any tax the law requires the Client to withhold, for which the Client will give the Provider the withholding certificate within 30 days.</w:t>
+        <w:t xml:space="preserve">The Client agrees to pay the Provider in accordance with the payment schedule in section 2.5, which is the only schedule of payments under this Agreement. Every invoice is payable within 14 days of its date, including invoices for any stock photography or other purchased materials authorised for the project. Each invoice is payable in full, without set-off or deduction, other than any tax the law requires the Client to withhold, for which the Client will give the Provider the withholding certificate within 30 days.</w:t>
       </w:r>
     </w:p>
     <w:p>
@@ -6364,7 +6364,7 @@
           <w:sz w:val="20"/>
           <w:szCs w:val="20"/>
         </w:rPr>
-        <w:t xml:space="preserve">The final payment is due on acceptance of the </w:t>
+        <w:t xml:space="preserve">The final payment is invoiced on acceptance of the </w:t>
       </w:r>
       <w:r>
         <w:rPr>
@@ -9030,7 +9030,7 @@
           <w:sz w:val="20"/>
           <w:szCs w:val="20"/>
         </w:rPr>
-        <w:t xml:space="preserve">Where the advance is kept, the Client pays the greater of the advance and the value of work performed together with third-party costs committed, and never the advance in addition to them. Where the advance counts toward the work, it is credited against what the Client pays. The Provider invoices any amount payable when this Agreement ends, which is due within 14 days, and refunds any amount the Client has paid above what is payable within 30 days.</w:t>
+        <w:t xml:space="preserve">Where the advance is kept, the Client pays the greater of the advance and the value of work performed together with third-party costs committed, and never the advance in addition to them. Where the advance counts toward the work, it is credited against what the Client pays. The Provider invoices any amount payable when this Agreement ends, which is payable within 14 days under section 4.0, and refunds any amount the Client has paid above what is payable within 30 days.</w:t>
       </w:r>
     </w:p>
     <w:p>
@@ -9364,7 +9364,7 @@
           <w:sz w:val="20"/>
           <w:szCs w:val="20"/>
         </w:rPr>
-        <w:t xml:space="preserve">If the Client fails to deliver necessary content, resources or feedback by the time it falls due, delivery dates move back by the length of the delay plus any time the Provider reasonably needs to reschedule its team, which the Provider will confirm in writing. Payment milestones do not move, other than the final payment, which is due on acceptance under section 3.4. If the Client is 7 days or more late, the Provider may move its team to other work, and restarting may take up to as long as the delay.</w:t>
+        <w:t xml:space="preserve">If the Client fails to deliver necessary content, resources or feedback by the time it falls due, delivery dates move back by the length of the delay plus any time the Provider reasonably needs to reschedule its team, which the Provider will confirm in writing. Payment milestones do not move, other than the final payment, which is invoiced on acceptance under section 3.4. If the Client is 7 days or more late, the Provider may move its team to other work, and restarting may take up to as long as the delay.</w:t>
       </w:r>
     </w:p>
     <w:p>

</xml_diff>